<commit_message>
ideas for week-by-week revisions
</commit_message>
<xml_diff>
--- a/exercises/hw1.docx
+++ b/exercises/hw1.docx
@@ -213,7 +213,23 @@
           <w:sz w:val="22"/>
           <w:szCs w:val="22"/>
         </w:rPr>
-        <w:t xml:space="preserve"> [</w:t>
+        <w:t xml:space="preserve"> </w:t>
+      </w:r>
+      <w:r>
+        <w:rPr>
+          <w:rFonts w:ascii="Arial" w:hAnsi="Arial" w:cs="Arial"/>
+          <w:sz w:val="22"/>
+          <w:szCs w:val="22"/>
+        </w:rPr>
+        <w:t xml:space="preserve">(only parts a – b) </w:t>
+      </w:r>
+      <w:r>
+        <w:rPr>
+          <w:rFonts w:ascii="Arial" w:hAnsi="Arial" w:cs="Arial"/>
+          <w:sz w:val="22"/>
+          <w:szCs w:val="22"/>
+        </w:rPr>
+        <w:t>[</w:t>
       </w:r>
       <w:r>
         <w:rPr>

</xml_diff>